<commit_message>
feat: bloqueia processamento se CNPJ ou Nome da Transportadora for 'Preencher aqui' e padroniza nomes de arquivos com Nome_Data_DD-MM-YYYY
</commit_message>
<xml_diff>
--- a/Manual_do_Analista_Lincros.docx
+++ b/Manual_do_Analista_Lincros.docx
@@ -10,7 +10,7 @@
         <w:rPr>
           <w:b/>
           <w:color w:val="1A365D"/>
-          <w:sz w:val="44"/>
+          <w:sz w:val="48"/>
         </w:rPr>
         <w:t>MANUAL DO ANALISTA DE LOGÍSTICA</w:t>
       </w:r>
@@ -25,7 +25,7 @@
           <w:color w:val="4A5568"/>
           <w:sz w:val="26"/>
         </w:rPr>
-        <w:t>Guia Oficial de Operação e Padronização no Modelo Lincros</w:t>
+        <w:t>Guia Detalhado de Padronização de Planilhas e Operação no Modelo Lincros</w:t>
         <w:br/>
       </w:r>
     </w:p>
@@ -35,12 +35,17 @@
         <w:pStyle w:val="Heading1"/>
       </w:pPr>
       <w:r>
-        <w:t>1. Fluxo Geral de Trabalho (Passo a Passo)</w:t>
+        <w:t>1. Visão Geral e Fluxo Recomendado de Trabalho</w:t>
       </w:r>
     </w:p>
     <w:p>
       <w:r>
-        <w:t>Para cadastrar uma nova operação de transporte ou tabela de frete/prazos na Lincros, siga o fluxo padronizado abaixo:</w:t>
+        <w:t>Este manual descreve detalhadamente o processo de preparação, conversão e estrutura exigida para cadastrar tabelas de frete, faixas de CEP, prazos e rotas no sistema Lincros.</w:t>
+      </w:r>
+    </w:p>
+    <w:p>
+      <w:r>
+        <w:t>Para evitar falhas de importação ou rejeição de arquivos na plataforma Lincros, os analistas devem seguir a sequência de 5 passos abaixo:</w:t>
       </w:r>
     </w:p>
     <w:p>
@@ -51,10 +56,10 @@
         <w:rPr>
           <w:b/>
         </w:rPr>
-        <w:t xml:space="preserve">Passo 1: Obter a Planilha Modelo Base: </w:t>
+        <w:t xml:space="preserve">Passo 1: Baixar a Planilha Modelo Base: </w:t>
       </w:r>
       <w:r>
-        <w:t>Baixe a planilha limpa clicando em 'Baixar Modelo Base (Vazio)' na barra lateral.</w:t>
+        <w:t>Acesse a barra lateral do aplicativo e clique no botão 'Baixar Modelo Base (Vazio)'. Este arquivo já contém todos os cabeçalhos reconhecidos pelas ferramentas do sistema.</w:t>
       </w:r>
     </w:p>
     <w:p>
@@ -65,10 +70,10 @@
         <w:rPr>
           <w:b/>
         </w:rPr>
-        <w:t xml:space="preserve">Passo 2: Identificar Locais (CEP ou IBGE): </w:t>
+        <w:t xml:space="preserve">Passo 2: Tratar Localidades (CEP ou IBGE): </w:t>
       </w:r>
       <w:r>
-        <w:t>Se você tiver faixas de CEP, use a aba 'Cadastro CEP'. Se tiver nomes de cidades, use a aba 'Preencher IBGE'.</w:t>
+        <w:t>Se o contrato for por faixas de CEP, utilize a aba 'Cadastro CEP'. Se o contrato for por municípios, utilize a aba 'Preencher IBGE' para garantir o código oficial de 7 dígitos.</w:t>
       </w:r>
     </w:p>
     <w:p>
@@ -79,10 +84,10 @@
         <w:rPr>
           <w:b/>
         </w:rPr>
-        <w:t xml:space="preserve">Passo 3: Montar Prazos e Frequência: </w:t>
+        <w:t xml:space="preserve">Passo 3: Definir Prazos e Frequências: </w:t>
       </w:r>
       <w:r>
-        <w:t>Informe os prazos em dias e marque a frequência semanal ('VERDADEIRO'/'FALSO').</w:t>
+        <w:t>Preencha a coluna de prazos em dias úteis e marque a frequência dos dias da semana (Segunda a Sábado) com a indicação de atendimento.</w:t>
       </w:r>
     </w:p>
     <w:p>
@@ -93,10 +98,10 @@
         <w:rPr>
           <w:b/>
         </w:rPr>
-        <w:t xml:space="preserve">Passo 4: Criar Regiões Lincros: </w:t>
+        <w:t xml:space="preserve">Passo 4: Gerar o Modelo Região Lincros: </w:t>
       </w:r>
       <w:r>
-        <w:t>Suba a planilha base na aba 'Criar Região' para gerar a estrutura oficial Lincros ('Regioes.xlsx').</w:t>
+        <w:t>Suba a planilha base tratada na aba 'Criar Região'. O sistema construirá a estrutura oficial com as abas 'regioes' e 'localizacoes_atendidas'.</w:t>
       </w:r>
     </w:p>
     <w:p>
@@ -107,10 +112,10 @@
         <w:rPr>
           <w:b/>
         </w:rPr>
-        <w:t xml:space="preserve">Passo 5: Gerar Matriz de Rotas: </w:t>
+        <w:t xml:space="preserve">Passo 5: Estruturar a Matriz de Rotas: </w:t>
       </w:r>
       <w:r>
-        <w:t>Na aba 'Gerar Rotas', cruze o arquivo de regiões com a origem para construir as rotas.</w:t>
+        <w:t>Na aba 'Gerar Rotas', envie a planilha de regiões gerada no passo anterior e vincule a origem para criar a matriz final de rotas.</w:t>
       </w:r>
     </w:p>
     <w:tbl>
@@ -120,17 +125,17 @@
         <w:tblLook w:firstColumn="1" w:firstRow="1" w:lastColumn="0" w:lastRow="0" w:noHBand="0" w:noVBand="1" w:val="04A0"/>
       </w:tblPr>
       <w:tblGrid>
-        <w:gridCol w:w="9936"/>
+        <w:gridCol w:w="10080"/>
       </w:tblGrid>
       <w:tr>
         <w:tc>
           <w:tcPr>
-            <w:tcW w:type="dxa" w:w="9936"/>
+            <w:tcW w:type="dxa" w:w="10080"/>
             <w:shd w:fill="FEF08A"/>
           </w:tcPr>
           <w:p>
             <w:pPr>
-              <w:spacing w:before="80" w:after="80"/>
+              <w:spacing w:before="120" w:after="120"/>
             </w:pPr>
             <w:r>
               <w:rPr>
@@ -138,7 +143,7 @@
                 <w:color w:val="854D0E"/>
                 <w:sz w:val="22"/>
               </w:rPr>
-              <w:t>📌 REGRA DE OURO PARA ANALISTAS</w:t>
+              <w:t>📌 MARCA-TEXTO DE VERIFICAÇÃO: CONFIGURAÇÕES OBRIGATÓRIAS DA BARRA LATERAL</w:t>
               <w:br/>
             </w:r>
             <w:r>
@@ -146,7 +151,7 @@
                 <w:color w:val="422006"/>
                 <w:sz w:val="20"/>
               </w:rPr>
-              <w:t>Sempre configure o CNPJ e o Nome da Transportadora Padrão na barra lateral esquerda antes de gerar as Regiões ou Rotas para evitar erros de importação!</w:t>
+              <w:t>Antes de clicar nos botões de processamento, verifique sempre se o CNPJ e o Nome da Transportadora estão devidamente preenchidos na barra lateral esquerda. O sistema utiliza esses valores para vincular as unidades atendidas nas tabelas Lincros.</w:t>
             </w:r>
           </w:p>
         </w:tc>
@@ -155,27 +160,22 @@
     <w:p/>
     <w:p>
       <w:pPr>
-        <w:pStyle w:val="Heading1"/>
+        <w:pStyle w:val="Heading2"/>
       </w:pPr>
       <w:r>
-        <w:t>2. Módulo: Cadastro CEP</w:t>
+        <w:t>1.1 Estrutura da Planilha Modelo Base Preenchida pelo Analista</w:t>
       </w:r>
     </w:p>
     <w:p>
       <w:r>
-        <w:t>Esta ferramenta analisa faixas de CEP coladas ou enviadas por planilha e consulta automaticamente o nome oficial no formato Cidade - UF nas APIs públicas dos Correios (ViaCEP, AwesomeAPI, ApiCEP e BrasilAPI).</w:t>
-      </w:r>
-    </w:p>
-    <w:p>
-      <w:r>
-        <w:t>Como o Analista preenche os dados de entrada:</w:t>
+        <w:t>Abaixo é ilustrado o modelo base completo (`Base_de_Origem_Template.xlsx`), destacando a presença das novas colunas de CEP Inicial e CEP Final ao lado do Código IBGE:</w:t>
       </w:r>
     </w:p>
     <w:p>
       <w:r>
         <w:drawing>
           <wp:inline xmlns:a="http://schemas.openxmlformats.org/drawingml/2006/main" xmlns:pic="http://schemas.openxmlformats.org/drawingml/2006/picture">
-            <wp:extent cx="5486400" cy="1786439"/>
+            <wp:extent cx="5943600" cy="1804933"/>
             <wp:docPr id="1" name="Picture 1"/>
             <wp:cNvGraphicFramePr>
               <a:graphicFrameLocks noChangeAspect="1"/>
@@ -184,7 +184,7 @@
               <a:graphicData uri="http://schemas.openxmlformats.org/drawingml/2006/picture">
                 <pic:pic>
                   <pic:nvPicPr>
-                    <pic:cNvPr id="0" name="cep_in.png"/>
+                    <pic:cNvPr id="0" name="fig01_base_analista.png"/>
                     <pic:cNvPicPr/>
                   </pic:nvPicPr>
                   <pic:blipFill>
@@ -196,7 +196,118 @@
                   <pic:spPr>
                     <a:xfrm>
                       <a:off x="0" y="0"/>
-                      <a:ext cx="5486400" cy="1786439"/>
+                      <a:ext cx="5943600" cy="1804933"/>
+                    </a:xfrm>
+                    <a:prstGeom prst="rect"/>
+                  </pic:spPr>
+                </pic:pic>
+              </a:graphicData>
+            </a:graphic>
+          </wp:inline>
+        </w:drawing>
+      </w:r>
+    </w:p>
+    <w:p>
+      <w:pPr>
+        <w:pStyle w:val="Heading1"/>
+      </w:pPr>
+      <w:r>
+        <w:t>2. Módulo: Cadastro CEP (Lincros)</w:t>
+      </w:r>
+    </w:p>
+    <w:p>
+      <w:r>
+        <w:t>O módulo Cadastro CEP permite ao analista colar uma lista de CEPs ou enviar uma planilha sem formatar. O sistema realiza consultas em tempo real nas APIs oficiais dos Correios (ViaCEP, AwesomeAPI, ApiCEP e BrasilAPI) utilizando multithreading paralelo para processar até 10.000 linhas em poucos segundos.</w:t>
+      </w:r>
+    </w:p>
+    <w:p>
+      <w:pPr>
+        <w:pStyle w:val="Heading2"/>
+      </w:pPr>
+      <w:r>
+        <w:t>2.1 Como o Analista deve preparar os dados de entrada</w:t>
+      </w:r>
+    </w:p>
+    <w:p>
+      <w:r>
+        <w:t>O analista pode colar a lista diretamente nas caixas de texto ou subir uma planilha Excel/CSV. O sistema aceita CEPs com hífen (`80010-000`) ou sem hífen (`80010000`). Se a coluna CEP Final não for informada, o sistema replica automaticamente o CEP Inicial.</w:t>
+      </w:r>
+    </w:p>
+    <w:p>
+      <w:r>
+        <w:drawing>
+          <wp:inline xmlns:a="http://schemas.openxmlformats.org/drawingml/2006/main" xmlns:pic="http://schemas.openxmlformats.org/drawingml/2006/picture">
+            <wp:extent cx="5669280" cy="2004707"/>
+            <wp:docPr id="2" name="Picture 2"/>
+            <wp:cNvGraphicFramePr>
+              <a:graphicFrameLocks noChangeAspect="1"/>
+            </wp:cNvGraphicFramePr>
+            <a:graphic>
+              <a:graphicData uri="http://schemas.openxmlformats.org/drawingml/2006/picture">
+                <pic:pic>
+                  <pic:nvPicPr>
+                    <pic:cNvPr id="0" name="fig02_cep_entrada.png"/>
+                    <pic:cNvPicPr/>
+                  </pic:nvPicPr>
+                  <pic:blipFill>
+                    <a:blip r:embed="rId10"/>
+                    <a:stretch>
+                      <a:fillRect/>
+                    </a:stretch>
+                  </pic:blipFill>
+                  <pic:spPr>
+                    <a:xfrm>
+                      <a:off x="0" y="0"/>
+                      <a:ext cx="5669280" cy="2004707"/>
+                    </a:xfrm>
+                    <a:prstGeom prst="rect"/>
+                  </pic:spPr>
+                </pic:pic>
+              </a:graphicData>
+            </a:graphic>
+          </wp:inline>
+        </w:drawing>
+      </w:r>
+    </w:p>
+    <w:p>
+      <w:pPr>
+        <w:pStyle w:val="Heading2"/>
+      </w:pPr>
+      <w:r>
+        <w:t>2.2 Como o Sistema retorna o Modelo CEP Lincros</w:t>
+      </w:r>
+    </w:p>
+    <w:p>
+      <w:r>
+        <w:t>Ao clicar em 'PROCESSAR CEPS &amp; CONSULTAR CORREIOS', o sistema gera a planilha 'Modelo CEP Preenchido.xlsx' no padrão estrito exigido pelo Lincros:</w:t>
+      </w:r>
+    </w:p>
+    <w:p>
+      <w:r>
+        <w:drawing>
+          <wp:inline xmlns:a="http://schemas.openxmlformats.org/drawingml/2006/main" xmlns:pic="http://schemas.openxmlformats.org/drawingml/2006/picture">
+            <wp:extent cx="5943600" cy="2101709"/>
+            <wp:docPr id="3" name="Picture 3"/>
+            <wp:cNvGraphicFramePr>
+              <a:graphicFrameLocks noChangeAspect="1"/>
+            </wp:cNvGraphicFramePr>
+            <a:graphic>
+              <a:graphicData uri="http://schemas.openxmlformats.org/drawingml/2006/picture">
+                <pic:pic>
+                  <pic:nvPicPr>
+                    <pic:cNvPr id="0" name="fig03_cep_retorno.png"/>
+                    <pic:cNvPicPr/>
+                  </pic:nvPicPr>
+                  <pic:blipFill>
+                    <a:blip r:embed="rId11"/>
+                    <a:stretch>
+                      <a:fillRect/>
+                    </a:stretch>
+                  </pic:blipFill>
+                  <pic:spPr>
+                    <a:xfrm>
+                      <a:off x="0" y="0"/>
+                      <a:ext cx="5943600" cy="2101709"/>
                     </a:xfrm>
                     <a:prstGeom prst="rect"/>
                   </pic:spPr>
@@ -214,17 +325,17 @@
         <w:tblLook w:firstColumn="1" w:firstRow="1" w:lastColumn="0" w:lastRow="0" w:noHBand="0" w:noVBand="1" w:val="04A0"/>
       </w:tblPr>
       <w:tblGrid>
-        <w:gridCol w:w="9936"/>
+        <w:gridCol w:w="10080"/>
       </w:tblGrid>
       <w:tr>
         <w:tc>
           <w:tcPr>
-            <w:tcW w:type="dxa" w:w="9936"/>
+            <w:tcW w:type="dxa" w:w="10080"/>
             <w:shd w:fill="FEF08A"/>
           </w:tcPr>
           <w:p>
             <w:pPr>
-              <w:spacing w:before="80" w:after="80"/>
+              <w:spacing w:before="120" w:after="120"/>
             </w:pPr>
             <w:r>
               <w:rPr>
@@ -232,7 +343,7 @@
                 <w:color w:val="854D0E"/>
                 <w:sz w:val="22"/>
               </w:rPr>
-              <w:t>📌 MARCA-TEXTO DE VERIFICAÇÃO</w:t>
+              <w:t>📌 MARCA-TEXTO DE VERIFICAÇÃO: DETALHAMENTO DAS COLUNAS GERADAS NO MODELO CEP</w:t>
               <w:br/>
             </w:r>
             <w:r>
@@ -240,7 +351,13 @@
                 <w:color w:val="422006"/>
                 <w:sz w:val="20"/>
               </w:rPr>
-              <w:t>Observe que a coluna Nome é gerada no formato exato 'Cidade - UF', o ID de Localização é mantido vazio e a coluna Ativo é preenchida como 'VERDADEIRO'.</w:t>
+              <w:t>• Coluna A (ID Localização): Mantida completamente vazia para ser gerada pela Lincros na importação.</w:t>
+              <w:br/>
+              <w:t>• Coluna B (CEP Inicial) e Coluna C (CEP Final): Formato numérico de 8 dígitos limpos (ex: 80010000).</w:t>
+              <w:br/>
+              <w:t>• Coluna D (Nome): Preenchida automaticamente no padrão 'Cidade - UF' (ex: Curitiba - PR).</w:t>
+              <w:br/>
+              <w:t>• Coluna E (Ativo): Preenchida exatamente como 'VERDADEIRO'.</w:t>
             </w:r>
           </w:p>
         </w:tc>
@@ -257,9 +374,134 @@
     </w:p>
     <w:p>
       <w:r>
-        <w:t>Insere o Código IBGE oficial de 7 dígitos da cidade. Utiliza algoritmos inteligentes de comparação exata e aproximada (Fuzzy Match).</w:t>
+        <w:t>Esta ferramenta lê a planilha base enviada pelo analista e localiza os códigos IBGE oficiais de 7 dígitos para cada cidade, evitando que o analista tenha que procurar manualmente código por código.</w:t>
       </w:r>
     </w:p>
+    <w:p>
+      <w:pPr>
+        <w:pStyle w:val="Heading2"/>
+      </w:pPr>
+      <w:r>
+        <w:t>3.1 Requisitos de Entrada e Retorno Gerado</w:t>
+      </w:r>
+    </w:p>
+    <w:p>
+      <w:r>
+        <w:t>A planilha do analista deve possuir as colunas chamadas 'Destino' (nome da cidade) e 'UF Destino' (sigla do estado com 2 letras).</w:t>
+      </w:r>
+    </w:p>
+    <w:p>
+      <w:r>
+        <w:drawing>
+          <wp:inline xmlns:a="http://schemas.openxmlformats.org/drawingml/2006/main" xmlns:pic="http://schemas.openxmlformats.org/drawingml/2006/picture">
+            <wp:extent cx="5669280" cy="1721629"/>
+            <wp:docPr id="4" name="Picture 4"/>
+            <wp:cNvGraphicFramePr>
+              <a:graphicFrameLocks noChangeAspect="1"/>
+            </wp:cNvGraphicFramePr>
+            <a:graphic>
+              <a:graphicData uri="http://schemas.openxmlformats.org/drawingml/2006/picture">
+                <pic:pic>
+                  <pic:nvPicPr>
+                    <pic:cNvPr id="0" name="fig04_ibge_entrada.png"/>
+                    <pic:cNvPicPr/>
+                  </pic:nvPicPr>
+                  <pic:blipFill>
+                    <a:blip r:embed="rId12"/>
+                    <a:stretch>
+                      <a:fillRect/>
+                    </a:stretch>
+                  </pic:blipFill>
+                  <pic:spPr>
+                    <a:xfrm>
+                      <a:off x="0" y="0"/>
+                      <a:ext cx="5669280" cy="1721629"/>
+                    </a:xfrm>
+                    <a:prstGeom prst="rect"/>
+                  </pic:spPr>
+                </pic:pic>
+              </a:graphicData>
+            </a:graphic>
+          </wp:inline>
+        </w:drawing>
+      </w:r>
+    </w:p>
+    <w:p>
+      <w:r>
+        <w:drawing>
+          <wp:inline xmlns:a="http://schemas.openxmlformats.org/drawingml/2006/main" xmlns:pic="http://schemas.openxmlformats.org/drawingml/2006/picture">
+            <wp:extent cx="5669280" cy="1721629"/>
+            <wp:docPr id="5" name="Picture 5"/>
+            <wp:cNvGraphicFramePr>
+              <a:graphicFrameLocks noChangeAspect="1"/>
+            </wp:cNvGraphicFramePr>
+            <a:graphic>
+              <a:graphicData uri="http://schemas.openxmlformats.org/drawingml/2006/picture">
+                <pic:pic>
+                  <pic:nvPicPr>
+                    <pic:cNvPr id="0" name="fig05_ibge_retorno.png"/>
+                    <pic:cNvPicPr/>
+                  </pic:nvPicPr>
+                  <pic:blipFill>
+                    <a:blip r:embed="rId13"/>
+                    <a:stretch>
+                      <a:fillRect/>
+                    </a:stretch>
+                  </pic:blipFill>
+                  <pic:spPr>
+                    <a:xfrm>
+                      <a:off x="0" y="0"/>
+                      <a:ext cx="5669280" cy="1721629"/>
+                    </a:xfrm>
+                    <a:prstGeom prst="rect"/>
+                  </pic:spPr>
+                </pic:pic>
+              </a:graphicData>
+            </a:graphic>
+          </wp:inline>
+        </w:drawing>
+      </w:r>
+    </w:p>
+    <w:tbl>
+      <w:tblPr>
+        <w:tblW w:type="auto" w:w="0"/>
+        <w:jc w:val="center"/>
+        <w:tblLook w:firstColumn="1" w:firstRow="1" w:lastColumn="0" w:lastRow="0" w:noHBand="0" w:noVBand="1" w:val="04A0"/>
+      </w:tblPr>
+      <w:tblGrid>
+        <w:gridCol w:w="10080"/>
+      </w:tblGrid>
+      <w:tr>
+        <w:tc>
+          <w:tcPr>
+            <w:tcW w:type="dxa" w:w="10080"/>
+            <w:shd w:fill="E0F2FE"/>
+          </w:tcPr>
+          <w:p>
+            <w:pPr>
+              <w:spacing w:before="120" w:after="120"/>
+            </w:pPr>
+            <w:r>
+              <w:rPr>
+                <w:b/>
+                <w:color w:val="854D0E"/>
+                <w:sz w:val="22"/>
+              </w:rPr>
+              <w:t>💡 RECURSO DE INTELIGÊNCIA: ALGORITMO DE BUSCA INTELIGENTE (FUZZY MATCHING)</w:t>
+              <w:br/>
+            </w:r>
+            <w:r>
+              <w:rPr>
+                <w:color w:val="422006"/>
+                <w:sz w:val="20"/>
+              </w:rPr>
+              <w:t>Se o nome da cidade tiver pequeno erro de digitação ou acentuação (ex: 'Sao Paulo' em vez de 'São Paulo'), o algoritmo de busca aproximada (Fuzzy Match com threshold de 80%) identifica o município correto e atribui o código IBGE correto sem interromper a execução.</w:t>
+            </w:r>
+          </w:p>
+        </w:tc>
+      </w:tr>
+    </w:tbl>
+    <w:p/>
     <w:p>
       <w:pPr>
         <w:pStyle w:val="Heading1"/>
@@ -270,12 +512,192 @@
     </w:p>
     <w:p>
       <w:r>
-        <w:t>Estrutura o arquivo oficial Lincros contendo as abas 'regioes' e 'localizacoes_atendidas'. Suporta criação tanto por Código IBGE quanto por intervalo de CEP (CEP Inicial e CEP Final).</w:t>
+        <w:t>Este módulo converte a planilha de trabalho do analista no arquivo de importação 'Modelo Região (.xlsx)', estruturando as abas internas 'regioes' e 'localizacoes_atendidas'.</w:t>
+      </w:r>
+    </w:p>
+    <w:p>
+      <w:pPr>
+        <w:pStyle w:val="Heading2"/>
+      </w:pPr>
+      <w:r>
+        <w:t>4.1 Suporte a Regiões por CEP Inicial/Final ou por Código IBGE</w:t>
+      </w:r>
+    </w:p>
+    <w:p>
+      <w:r>
+        <w:t>O analista pode definir a região usando intervalos de CEP ou códigos IBGE de cidades. O sistema identifica automaticamente as colunas presentes na planilha base e preenche os campos correspondentes na aba 'localizacoes_atendidas':</w:t>
+      </w:r>
+    </w:p>
+    <w:p>
+      <w:r>
+        <w:drawing>
+          <wp:inline xmlns:a="http://schemas.openxmlformats.org/drawingml/2006/main" xmlns:pic="http://schemas.openxmlformats.org/drawingml/2006/picture">
+            <wp:extent cx="5943600" cy="1804933"/>
+            <wp:docPr id="6" name="Picture 6"/>
+            <wp:cNvGraphicFramePr>
+              <a:graphicFrameLocks noChangeAspect="1"/>
+            </wp:cNvGraphicFramePr>
+            <a:graphic>
+              <a:graphicData uri="http://schemas.openxmlformats.org/drawingml/2006/picture">
+                <pic:pic>
+                  <pic:nvPicPr>
+                    <pic:cNvPr id="0" name="fig06_regiao_retorno.png"/>
+                    <pic:cNvPicPr/>
+                  </pic:nvPicPr>
+                  <pic:blipFill>
+                    <a:blip r:embed="rId14"/>
+                    <a:stretch>
+                      <a:fillRect/>
+                    </a:stretch>
+                  </pic:blipFill>
+                  <pic:spPr>
+                    <a:xfrm>
+                      <a:off x="0" y="0"/>
+                      <a:ext cx="5943600" cy="1804933"/>
+                    </a:xfrm>
+                    <a:prstGeom prst="rect"/>
+                  </pic:spPr>
+                </pic:pic>
+              </a:graphicData>
+            </a:graphic>
+          </wp:inline>
+        </w:drawing>
+      </w:r>
+    </w:p>
+    <w:tbl>
+      <w:tblPr>
+        <w:tblW w:type="auto" w:w="0"/>
+        <w:jc w:val="center"/>
+        <w:tblLook w:firstColumn="1" w:firstRow="1" w:lastColumn="0" w:lastRow="0" w:noHBand="0" w:noVBand="1" w:val="04A0"/>
+      </w:tblPr>
+      <w:tblGrid>
+        <w:gridCol w:w="10080"/>
+      </w:tblGrid>
+      <w:tr>
+        <w:tc>
+          <w:tcPr>
+            <w:tcW w:type="dxa" w:w="10080"/>
+            <w:shd w:fill="FEF08A"/>
+          </w:tcPr>
+          <w:p>
+            <w:pPr>
+              <w:spacing w:before="120" w:after="120"/>
+            </w:pPr>
+            <w:r>
+              <w:rPr>
+                <w:b/>
+                <w:color w:val="854D0E"/>
+                <w:sz w:val="22"/>
+              </w:rPr>
+              <w:t>📌 MARCA-TEXTO DE VERIFICAÇÃO: ESTRUTURA DAS ABAS GERADAS NO MODELO REGIÃO</w:t>
+              <w:br/>
+            </w:r>
+            <w:r>
+              <w:rPr>
+                <w:color w:val="422006"/>
+                <w:sz w:val="20"/>
+              </w:rPr>
+              <w:t>• Aba 'regioes': Agrupa os nomes de regiões únicas com o CNPJ da transportadora e insere Ativo = 'VERDADEIRO'.</w:t>
+              <w:br/>
+              <w:t>• Aba 'localizacoes_atendidas':</w:t>
+              <w:br/>
+              <w:t xml:space="preserve">   - Se a origem for CEP: Preenche Coluna C (CEP Inicial) e Coluna D (CEP Final).</w:t>
+              <w:br/>
+              <w:t xml:space="preserve">   - Se a origem for Município: Preenche Coluna E (Código IBGE da Cidade).</w:t>
+            </w:r>
+          </w:p>
+        </w:tc>
+      </w:tr>
+    </w:tbl>
+    <w:p/>
+    <w:p>
+      <w:pPr>
+        <w:pStyle w:val="Heading1"/>
+      </w:pPr>
+      <w:r>
+        <w:t>5. Módulo: Gerar Rotas Lincros</w:t>
+      </w:r>
+    </w:p>
+    <w:p>
+      <w:r>
+        <w:t>A ferramenta de rotas cruza o arquivo de regiões preenchido no passo anterior com o ponto de origem da carga (Cidade IBGE ou Nome da Região) para montar a matriz completa de rotas da transportadora.</w:t>
+      </w:r>
+    </w:p>
+    <w:p>
+      <w:r>
+        <w:drawing>
+          <wp:inline xmlns:a="http://schemas.openxmlformats.org/drawingml/2006/main" xmlns:pic="http://schemas.openxmlformats.org/drawingml/2006/picture">
+            <wp:extent cx="5943600" cy="1508158"/>
+            <wp:docPr id="7" name="Picture 7"/>
+            <wp:cNvGraphicFramePr>
+              <a:graphicFrameLocks noChangeAspect="1"/>
+            </wp:cNvGraphicFramePr>
+            <a:graphic>
+              <a:graphicData uri="http://schemas.openxmlformats.org/drawingml/2006/picture">
+                <pic:pic>
+                  <pic:nvPicPr>
+                    <pic:cNvPr id="0" name="fig07_rotas_retorno.png"/>
+                    <pic:cNvPicPr/>
+                  </pic:nvPicPr>
+                  <pic:blipFill>
+                    <a:blip r:embed="rId15"/>
+                    <a:stretch>
+                      <a:fillRect/>
+                    </a:stretch>
+                  </pic:blipFill>
+                  <pic:spPr>
+                    <a:xfrm>
+                      <a:off x="0" y="0"/>
+                      <a:ext cx="5943600" cy="1508158"/>
+                    </a:xfrm>
+                    <a:prstGeom prst="rect"/>
+                  </pic:spPr>
+                </pic:pic>
+              </a:graphicData>
+            </a:graphic>
+          </wp:inline>
+        </w:drawing>
+      </w:r>
+    </w:p>
+    <w:p>
+      <w:pPr>
+        <w:pStyle w:val="Heading1"/>
+      </w:pPr>
+      <w:r>
+        <w:t>6. Ferramentas Auxiliares e Restrições por Pessoas</w:t>
+      </w:r>
+    </w:p>
+    <w:p>
+      <w:pPr>
+        <w:pStyle w:val="Heading2"/>
+      </w:pPr>
+      <w:r>
+        <w:t>6.1 Conversores S/N e STQQS</w:t>
+      </w:r>
+    </w:p>
+    <w:p>
+      <w:r>
+        <w:t>• Converter S/N: Transforma marcações simples nas colunas dos dias da semana ('S', 'N', '1', '0', 'X') nos valores padrão Lincros ('VERDADEIRO' e 'FALSO').</w:t>
+        <w:br/>
+        <w:t>• Converter STQQS: Lê strings codificadas de frequência semanal (ex: 'STQQS..') e desmembra os atendimentos em colunas individuais por dia.</w:t>
+      </w:r>
+    </w:p>
+    <w:p>
+      <w:pPr>
+        <w:pStyle w:val="Heading2"/>
+      </w:pPr>
+      <w:r>
+        <w:t>6.2 Gerador de Restrições por Pessoas (TDE/TAE)</w:t>
+      </w:r>
+    </w:p>
+    <w:p>
+      <w:r>
+        <w:t>Esta ferramenta lê listas de cadastros de clientes restritos (CNPJ/CPF, Razão Social e Valor) e gera um arquivo compactado `.ZIP` contendo múltiplos arquivos Excel formatados no modelo de Restrições por Pessoas do Lincros, divididos conforme o limite máximo de linhas por arquivo estipulado pelo analista.</w:t>
       </w:r>
     </w:p>
     <w:sectPr>
       <w:pgSz w:w="12240" w:h="15840"/>
-      <w:pgMar w:top="1152" w:right="1152" w:bottom="1152" w:left="1152" w:header="720" w:footer="720" w:gutter="0"/>
+      <w:pgMar w:top="1080" w:right="1080" w:bottom="1080" w:left="1080" w:header="720" w:footer="720" w:gutter="0"/>
       <w:cols w:space="720"/>
       <w:docGrid w:linePitch="360"/>
     </w:sectPr>

</xml_diff>